<commit_message>
Auto-load default lecture data on startup and group fields into 5 sections
</commit_message>
<xml_diff>
--- a/sample/MAU_BaiGiang.docx
+++ b/sample/MAU_BaiGiang.docx
@@ -627,7 +627,7 @@
           <w:b/>
           <w:szCs w:val="28"/>
         </w:rPr>
-        <w:t>{{Cấp bậc, học vị giảng viên biên soạn}} {{Họ tên giảng viên biên soạn}}</w:t>
+        <w:t>{{Cấp bậc, học vị, họ tên giảng viên biên soạn}}</w:t>
       </w:r>
     </w:p>
     <w:p>
@@ -882,7 +882,7 @@
           <w:rFonts w:eastAsia="Times New Roman"/>
           <w:szCs w:val="28"/>
         </w:rPr>
-        <w:t>Giảng viên: {{Họ tên giảng viên biên soạn}}</w:t>
+        <w:t>Giảng viên: {{Cấp bậc, học vị, họ tên giảng viên biên soạn}}</w:t>
       </w:r>
     </w:p>
     <w:p>
@@ -938,7 +938,7 @@
           <w:rFonts w:eastAsia="Times New Roman"/>
           <w:szCs w:val="28"/>
         </w:rPr>
-        <w:t>- Cấp bậc, chức danh khoa học, họ tên người thông qua: {{Cấp bậc, học vị người thông qua}} {{Họ tên người thông qua}}</w:t>
+        <w:t>- Cấp bậc, chức danh khoa học, họ tên người thông qua: {{Cấp bậc, học vị, họ tên người thông qua}}</w:t>
       </w:r>
     </w:p>
     <w:p>
@@ -1358,7 +1358,7 @@
           <w:szCs w:val="28"/>
         </w:rPr>
         <w:tab/>
-        <w:t xml:space="preserve"> {{Cấp bậc, học vị người phê duyệt}} {{Họ tên người phê duyệt}}</w:t>
+        <w:t xml:space="preserve"> {{Cấp bậc, học vị, họ tên người phê duyệt}}</w:t>
       </w:r>
     </w:p>
     <w:p>
@@ -2435,7 +2435,7 @@
                 <w:szCs w:val="28"/>
                 <w:lang w:val="pt-BR"/>
               </w:rPr>
-              <w:t>{{Cấp bậc, học vị người thông qua}} {{Họ tên người thông qua}}</w:t>
+              <w:t>{{Cấp bậc, học vị, họ tên người thông qua}}</w:t>
             </w:r>
           </w:p>
         </w:tc>
@@ -2549,7 +2549,7 @@
                 <w:b/>
                 <w:szCs w:val="28"/>
               </w:rPr>
-              <w:t>{{Cấp bậc, học vị giảng viên biên soạn}} {{Họ tên giảng viên biên soạn}}</w:t>
+              <w:t>{{Cấp bậc, học vị, họ tên giảng viên biên soạn}}</w:t>
             </w:r>
           </w:p>
         </w:tc>

</xml_diff>